<commit_message>
Strona tytulowa wg szablonu UR + dane: Ernest Kurdziel, album 72714, dr Weronika Cyganik
Co-authored-by: ernestkurdziel-max <ernestkurdziel-max@users.noreply.github.com>
</commit_message>
<xml_diff>
--- a/Fizjoterapia_mukowiscydoza_praca.docx
+++ b/Fizjoterapia_mukowiscydoza_praca.docx
@@ -4,152 +4,391 @@
   <w:body>
     <w:p>
       <w:pPr>
-        <w:spacing w:before="120" w:after="120"/>
+        <w:spacing w:before="0" w:after="120" w:line="240" w:lineRule="auto"/>
         <w:jc w:val="center"/>
       </w:pPr>
       <w:r>
         <w:rPr>
+          <w:rFonts w:ascii="Bookman Old Style" w:hAnsi="Bookman Old Style" w:eastAsia="Bookman Old Style"/>
           <w:b w:val="0"/>
-          <w:i w:val="0"/>
           <w:sz w:val="24"/>
         </w:rPr>
-        <w:t>Uczelnia / Wydział</w:t>
       </w:r>
     </w:p>
     <w:p>
       <w:pPr>
-        <w:spacing w:before="0" w:after="480"/>
+        <w:spacing w:before="0" w:after="120" w:line="240" w:lineRule="auto"/>
         <w:jc w:val="center"/>
       </w:pPr>
       <w:r>
         <w:rPr>
+          <w:rFonts w:ascii="Bookman Old Style" w:hAnsi="Bookman Old Style" w:eastAsia="Bookman Old Style"/>
           <w:b w:val="0"/>
-          <w:i w:val="0"/>
           <w:sz w:val="24"/>
         </w:rPr>
-        <w:t>Kierunek: Fizjoterapia</w:t>
-      </w:r>
-    </w:p>
-    <w:p/>
-    <w:p/>
-    <w:p/>
-    <w:p>
-      <w:pPr>
-        <w:spacing w:before="0" w:after="40"/>
-        <w:jc w:val="center"/>
-      </w:pPr>
-      <w:r>
-        <w:rPr>
-          <w:b w:val="0"/>
-          <w:i w:val="0"/>
-          <w:sz w:val="24"/>
-        </w:rPr>
-        <w:t>Imię i Nazwisko</w:t>
       </w:r>
     </w:p>
     <w:p>
       <w:pPr>
-        <w:spacing w:before="0" w:after="720"/>
+        <w:spacing w:before="0" w:after="120" w:line="240" w:lineRule="auto"/>
         <w:jc w:val="center"/>
       </w:pPr>
       <w:r>
         <w:rPr>
+          <w:rFonts w:ascii="Bookman Old Style" w:hAnsi="Bookman Old Style" w:eastAsia="Bookman Old Style"/>
           <w:b w:val="0"/>
-          <w:i/>
-          <w:sz w:val="22"/>
+          <w:sz w:val="32"/>
         </w:rPr>
-        <w:t>Numer albumu: ........</w:t>
+        <w:t>Kierunek FIZJOTERAPIA</w:t>
       </w:r>
     </w:p>
     <w:p>
       <w:pPr>
-        <w:spacing w:before="240" w:after="200"/>
+        <w:spacing w:before="0" w:after="120" w:line="240" w:lineRule="auto"/>
         <w:jc w:val="center"/>
       </w:pPr>
       <w:r>
         <w:rPr>
-          <w:b/>
-          <w:i w:val="0"/>
-          <w:sz w:val="36"/>
+          <w:rFonts w:ascii="Bookman Old Style" w:hAnsi="Bookman Old Style" w:eastAsia="Bookman Old Style"/>
+          <w:b w:val="0"/>
+          <w:sz w:val="32"/>
         </w:rPr>
-        <w:t>Zasady planowania i programowania fizjoterapii pacjentów z chorobami układu oddechowego</w:t>
+        <w:t>STUDIA NIESTACJONARNE</w:t>
       </w:r>
     </w:p>
     <w:p>
       <w:pPr>
-        <w:spacing w:before="0" w:after="720"/>
+        <w:spacing w:before="0" w:after="120" w:line="240" w:lineRule="auto"/>
         <w:jc w:val="center"/>
       </w:pPr>
       <w:r>
         <w:rPr>
+          <w:rFonts w:ascii="Bookman Old Style" w:hAnsi="Bookman Old Style" w:eastAsia="Bookman Old Style"/>
           <w:b w:val="0"/>
-          <w:i/>
-          <w:sz w:val="28"/>
-        </w:rPr>
-        <w:t>na przykładzie mukowiscydozy (zwłóknienia torbielowatego)</w:t>
-      </w:r>
-    </w:p>
-    <w:p/>
-    <w:p/>
-    <w:p/>
-    <w:p/>
-    <w:p>
-      <w:pPr>
-        <w:spacing w:before="0" w:after="40"/>
-        <w:jc w:val="center"/>
-      </w:pPr>
-      <w:r>
-        <w:rPr>
-          <w:b w:val="0"/>
-          <w:i/>
           <w:sz w:val="24"/>
         </w:rPr>
-        <w:t>Praca zaliczeniowa</w:t>
       </w:r>
     </w:p>
     <w:p>
       <w:pPr>
-        <w:spacing w:before="0" w:after="40"/>
+        <w:spacing w:before="0" w:after="120" w:line="240" w:lineRule="auto"/>
         <w:jc w:val="center"/>
       </w:pPr>
       <w:r>
         <w:rPr>
+          <w:rFonts w:ascii="Bookman Old Style" w:hAnsi="Bookman Old Style" w:eastAsia="Bookman Old Style"/>
           <w:b w:val="0"/>
-          <w:i w:val="0"/>
           <w:sz w:val="24"/>
         </w:rPr>
-        <w:t>napisana pod kierunkiem</w:t>
       </w:r>
     </w:p>
     <w:p>
       <w:pPr>
-        <w:spacing w:before="0" w:after="960"/>
+        <w:spacing w:before="0" w:after="120" w:line="240" w:lineRule="auto"/>
         <w:jc w:val="center"/>
       </w:pPr>
       <w:r>
         <w:rPr>
+          <w:rFonts w:ascii="Bookman Old Style" w:hAnsi="Bookman Old Style" w:eastAsia="Bookman Old Style"/>
           <w:b w:val="0"/>
-          <w:i w:val="0"/>
           <w:sz w:val="24"/>
         </w:rPr>
-        <w:t>dr / dr hab. ........................</w:t>
       </w:r>
     </w:p>
-    <w:p/>
-    <w:p/>
-    <w:p/>
     <w:p>
       <w:pPr>
-        <w:spacing w:before="0" w:after="120"/>
+        <w:spacing w:before="0" w:after="120" w:line="240" w:lineRule="auto"/>
         <w:jc w:val="center"/>
       </w:pPr>
       <w:r>
         <w:rPr>
+          <w:rFonts w:ascii="Bookman Old Style" w:hAnsi="Bookman Old Style" w:eastAsia="Bookman Old Style"/>
+          <w:b/>
+          <w:sz w:val="40"/>
+        </w:rPr>
+        <w:t>Zdrowie Publiczne</w:t>
+      </w:r>
+    </w:p>
+    <w:p>
+      <w:pPr>
+        <w:spacing w:before="0" w:after="120" w:line="240" w:lineRule="auto"/>
+        <w:jc w:val="center"/>
+      </w:pPr>
+      <w:r>
+        <w:rPr>
+          <w:rFonts w:ascii="Bookman Old Style" w:hAnsi="Bookman Old Style" w:eastAsia="Bookman Old Style"/>
           <w:b w:val="0"/>
-          <w:i w:val="0"/>
           <w:sz w:val="24"/>
         </w:rPr>
-        <w:t>Miejscowość, 2026</w:t>
+        <w:t>Prowadzący: dr Weronika Cyganik</w:t>
+      </w:r>
+    </w:p>
+    <w:p>
+      <w:pPr>
+        <w:spacing w:before="0" w:after="120" w:line="240" w:lineRule="auto"/>
+        <w:jc w:val="center"/>
+      </w:pPr>
+      <w:r>
+        <w:rPr>
+          <w:rFonts w:ascii="Bookman Old Style" w:hAnsi="Bookman Old Style" w:eastAsia="Bookman Old Style"/>
+          <w:b w:val="0"/>
+          <w:sz w:val="24"/>
+        </w:rPr>
+      </w:r>
+    </w:p>
+    <w:p>
+      <w:pPr>
+        <w:spacing w:before="0" w:after="120" w:line="240" w:lineRule="auto"/>
+        <w:jc w:val="center"/>
+      </w:pPr>
+      <w:r>
+        <w:rPr>
+          <w:rFonts w:ascii="Bookman Old Style" w:hAnsi="Bookman Old Style" w:eastAsia="Bookman Old Style"/>
+          <w:b w:val="0"/>
+          <w:sz w:val="24"/>
+        </w:rPr>
+      </w:r>
+    </w:p>
+    <w:p>
+      <w:pPr>
+        <w:spacing w:before="0" w:after="120" w:line="240" w:lineRule="auto"/>
+        <w:jc w:val="center"/>
+      </w:pPr>
+      <w:r>
+        <w:rPr>
+          <w:rFonts w:ascii="Bookman Old Style" w:hAnsi="Bookman Old Style" w:eastAsia="Bookman Old Style"/>
+          <w:b w:val="0"/>
+          <w:sz w:val="24"/>
+        </w:rPr>
+      </w:r>
+    </w:p>
+    <w:p>
+      <w:pPr>
+        <w:spacing w:before="0" w:after="120" w:line="240" w:lineRule="auto"/>
+        <w:jc w:val="center"/>
+      </w:pPr>
+      <w:r>
+        <w:rPr>
+          <w:rFonts w:ascii="Bookman Old Style" w:hAnsi="Bookman Old Style" w:eastAsia="Bookman Old Style"/>
+          <w:b w:val="0"/>
+          <w:sz w:val="24"/>
+        </w:rPr>
+        <w:t>PROJEKT SAMODZIELNY</w:t>
+      </w:r>
+    </w:p>
+    <w:p>
+      <w:pPr>
+        <w:spacing w:before="0" w:after="120" w:line="240" w:lineRule="auto"/>
+        <w:jc w:val="center"/>
+      </w:pPr>
+      <w:r>
+        <w:rPr>
+          <w:rFonts w:ascii="Bookman Old Style" w:hAnsi="Bookman Old Style" w:eastAsia="Bookman Old Style"/>
+          <w:b w:val="0"/>
+          <w:sz w:val="24"/>
+        </w:rPr>
+        <w:t>1MFzZ/2024 – grupa projektowa  ………….</w:t>
+      </w:r>
+    </w:p>
+    <w:p>
+      <w:pPr>
+        <w:spacing w:before="0" w:after="120" w:line="240" w:lineRule="auto"/>
+        <w:jc w:val="center"/>
+      </w:pPr>
+      <w:r>
+        <w:rPr>
+          <w:rFonts w:ascii="Bookman Old Style" w:hAnsi="Bookman Old Style" w:eastAsia="Bookman Old Style"/>
+          <w:b w:val="0"/>
+          <w:sz w:val="24"/>
+        </w:rPr>
+      </w:r>
+    </w:p>
+    <w:p>
+      <w:pPr>
+        <w:spacing w:before="0" w:after="120" w:line="240" w:lineRule="auto"/>
+        <w:jc w:val="center"/>
+      </w:pPr>
+      <w:r>
+        <w:rPr>
+          <w:rFonts w:ascii="Bookman Old Style" w:hAnsi="Bookman Old Style" w:eastAsia="Bookman Old Style"/>
+          <w:b w:val="0"/>
+          <w:sz w:val="24"/>
+        </w:rPr>
+      </w:r>
+    </w:p>
+    <w:p>
+      <w:pPr>
+        <w:spacing w:before="0" w:after="120" w:line="240" w:lineRule="auto"/>
+        <w:jc w:val="center"/>
+      </w:pPr>
+      <w:r>
+        <w:rPr>
+          <w:rFonts w:ascii="Bookman Old Style" w:hAnsi="Bookman Old Style" w:eastAsia="Bookman Old Style"/>
+          <w:b w:val="0"/>
+          <w:sz w:val="24"/>
+        </w:rPr>
+      </w:r>
+    </w:p>
+    <w:p>
+      <w:pPr>
+        <w:spacing w:before="0" w:after="120" w:line="240" w:lineRule="auto"/>
+        <w:jc w:val="center"/>
+      </w:pPr>
+      <w:r>
+        <w:rPr>
+          <w:rFonts w:ascii="Bookman Old Style" w:hAnsi="Bookman Old Style" w:eastAsia="Bookman Old Style"/>
+          <w:b/>
+          <w:sz w:val="40"/>
+        </w:rPr>
+        <w:t>Tytuł: Zasady planowania i programowania fizjoterapii pacjentów z chorobami układu oddechowego na przykładzie mukowiscydozy</w:t>
+      </w:r>
+    </w:p>
+    <w:p>
+      <w:pPr>
+        <w:spacing w:before="0" w:after="120" w:line="240" w:lineRule="auto"/>
+        <w:jc w:val="center"/>
+      </w:pPr>
+      <w:r>
+        <w:rPr>
+          <w:rFonts w:ascii="Bookman Old Style" w:hAnsi="Bookman Old Style" w:eastAsia="Bookman Old Style"/>
+          <w:b w:val="0"/>
+          <w:sz w:val="24"/>
+        </w:rPr>
+      </w:r>
+    </w:p>
+    <w:p>
+      <w:pPr>
+        <w:spacing w:before="0" w:after="120" w:line="240" w:lineRule="auto"/>
+        <w:jc w:val="center"/>
+      </w:pPr>
+      <w:r>
+        <w:rPr>
+          <w:rFonts w:ascii="Bookman Old Style" w:hAnsi="Bookman Old Style" w:eastAsia="Bookman Old Style"/>
+          <w:b w:val="0"/>
+          <w:sz w:val="24"/>
+        </w:rPr>
+      </w:r>
+    </w:p>
+    <w:p>
+      <w:pPr>
+        <w:spacing w:before="0" w:after="120" w:line="240" w:lineRule="auto"/>
+        <w:jc w:val="center"/>
+      </w:pPr>
+      <w:r>
+        <w:rPr>
+          <w:rFonts w:ascii="Bookman Old Style" w:hAnsi="Bookman Old Style" w:eastAsia="Bookman Old Style"/>
+          <w:b w:val="0"/>
+          <w:sz w:val="24"/>
+        </w:rPr>
+      </w:r>
+    </w:p>
+    <w:p>
+      <w:pPr>
+        <w:spacing w:before="0" w:after="120" w:line="240" w:lineRule="auto"/>
+        <w:jc w:val="center"/>
+      </w:pPr>
+      <w:r>
+        <w:rPr>
+          <w:rFonts w:ascii="Bookman Old Style" w:hAnsi="Bookman Old Style" w:eastAsia="Bookman Old Style"/>
+          <w:b w:val="0"/>
+          <w:sz w:val="28"/>
+        </w:rPr>
+        <w:t>Ernest Kurdziel</w:t>
+      </w:r>
+    </w:p>
+    <w:p>
+      <w:pPr>
+        <w:spacing w:before="0" w:after="120" w:line="240" w:lineRule="auto"/>
+        <w:jc w:val="center"/>
+      </w:pPr>
+      <w:r>
+        <w:rPr>
+          <w:rFonts w:ascii="Bookman Old Style" w:hAnsi="Bookman Old Style" w:eastAsia="Bookman Old Style"/>
+          <w:b w:val="0"/>
+          <w:sz w:val="28"/>
+        </w:rPr>
+        <w:t>(Imię i nazwisko)</w:t>
+      </w:r>
+    </w:p>
+    <w:p>
+      <w:pPr>
+        <w:spacing w:before="0" w:after="120" w:line="240" w:lineRule="auto"/>
+        <w:jc w:val="center"/>
+      </w:pPr>
+      <w:r>
+        <w:rPr>
+          <w:rFonts w:ascii="Bookman Old Style" w:hAnsi="Bookman Old Style" w:eastAsia="Bookman Old Style"/>
+          <w:b w:val="0"/>
+          <w:sz w:val="24"/>
+        </w:rPr>
+      </w:r>
+    </w:p>
+    <w:p>
+      <w:pPr>
+        <w:spacing w:before="0" w:after="120" w:line="240" w:lineRule="auto"/>
+        <w:jc w:val="center"/>
+      </w:pPr>
+      <w:r>
+        <w:rPr>
+          <w:rFonts w:ascii="Bookman Old Style" w:hAnsi="Bookman Old Style" w:eastAsia="Bookman Old Style"/>
+          <w:b w:val="0"/>
+          <w:sz w:val="28"/>
+        </w:rPr>
+        <w:t>72714</w:t>
+      </w:r>
+    </w:p>
+    <w:p>
+      <w:pPr>
+        <w:spacing w:before="0" w:after="120" w:line="240" w:lineRule="auto"/>
+        <w:jc w:val="center"/>
+      </w:pPr>
+      <w:r>
+        <w:rPr>
+          <w:rFonts w:ascii="Bookman Old Style" w:hAnsi="Bookman Old Style" w:eastAsia="Bookman Old Style"/>
+          <w:b w:val="0"/>
+          <w:sz w:val="28"/>
+        </w:rPr>
+        <w:t>(numer albumu)</w:t>
+      </w:r>
+    </w:p>
+    <w:p>
+      <w:pPr>
+        <w:spacing w:before="0" w:after="120" w:line="240" w:lineRule="auto"/>
+        <w:jc w:val="center"/>
+      </w:pPr>
+      <w:r>
+        <w:rPr>
+          <w:rFonts w:ascii="Bookman Old Style" w:hAnsi="Bookman Old Style" w:eastAsia="Bookman Old Style"/>
+          <w:b w:val="0"/>
+          <w:sz w:val="24"/>
+        </w:rPr>
+      </w:r>
+    </w:p>
+    <w:p>
+      <w:pPr>
+        <w:spacing w:before="0" w:after="120" w:line="240" w:lineRule="auto"/>
+        <w:jc w:val="center"/>
+      </w:pPr>
+      <w:r>
+        <w:rPr>
+          <w:rFonts w:ascii="Bookman Old Style" w:hAnsi="Bookman Old Style" w:eastAsia="Bookman Old Style"/>
+          <w:b w:val="0"/>
+          <w:sz w:val="24"/>
+        </w:rPr>
+      </w:r>
+    </w:p>
+    <w:p>
+      <w:pPr>
+        <w:spacing w:before="0" w:after="120" w:line="240" w:lineRule="auto"/>
+        <w:jc w:val="center"/>
+      </w:pPr>
+      <w:r>
+        <w:rPr>
+          <w:rFonts w:ascii="Bookman Old Style" w:hAnsi="Bookman Old Style" w:eastAsia="Bookman Old Style"/>
+          <w:b/>
+          <w:sz w:val="28"/>
+        </w:rPr>
+        <w:t>RZESZÓW 2024</w:t>
       </w:r>
     </w:p>
     <w:p>

</xml_diff>